<commit_message>
ci: daily run 2026-09-30
</commit_message>
<xml_diff>
--- a/tailored/cv_allstar-technology_mernstack-developer-node-js.docx
+++ b/tailored/cv_allstar-technology_mernstack-developer-node-js.docx
@@ -17,7 +17,7 @@
     </w:p>
     <w:p>
       <w:r>
-        <w:t>muzzamilhassandev@gmail.com | +923055779207</w:t>
+        <w:t>muzzamilhassandev@gmail.com | +923055779207 | https://muzzamilhassandev.vercel.app/</w:t>
       </w:r>
     </w:p>
     <w:p>
@@ -30,7 +30,7 @@
     </w:p>
     <w:p>
       <w:r>
-        <w:t>Full Stack Developer with expertise in the MERN stack, specializing in Next.js, TypeScript, and backend development with Node.js and Express.js. Strong experience with PostgreSQL and other SQL databases, along with modern frontend technologies. Proven ability to build production-grade SaaS applications with a focus on performance, scalability, and clean code architecture.</w:t>
+        <w:t>Full Stack Developer with expertise in architecting and shipping production-grade SaaS products using the MERN stack. Proficient in Next.js, Express.js, TypeScript, and PostgreSQL with strong experience in building scalable backend systems and modern frontend interfaces. Experienced in developing complete solutions from database design to deployment with CI/CD pipelines.</w:t>
       </w:r>
     </w:p>
     <w:p>
@@ -54,7 +54,7 @@
         <w:pStyle w:val="ListBullet"/>
       </w:pPr>
       <w:r>
-        <w:t>**Backend**: Node.js, Express.js, REST API Design, JWT/OAuth2 Authentication, RBAC</w:t>
+        <w:t>**Backend**: Node.js, Express.js, NestJS, TypeScript, REST API Design, JWT/OAuth2 Authentication, RBAC</w:t>
       </w:r>
     </w:p>
     <w:p>
@@ -70,7 +70,7 @@
         <w:pStyle w:val="ListBullet"/>
       </w:pPr>
       <w:r>
-        <w:t>**Cloud &amp; DevOps**: Vercel, Docker, GitHub Actions, AWS Amplify</w:t>
+        <w:t>**DevOps &amp; Deployment**: Vercel (CI/CD, Edge Functions), Docker, GitHub Actions, AWS Amplify</w:t>
       </w:r>
     </w:p>
     <w:p>
@@ -78,15 +78,7 @@
         <w:pStyle w:val="ListBullet"/>
       </w:pPr>
       <w:r>
-        <w:t>**Tools**: Git, GitHub, JIRA, Figma, Stripe API, Google Maps API</w:t>
-      </w:r>
-    </w:p>
-    <w:p>
-      <w:pPr>
-        <w:pStyle w:val="ListBullet"/>
-      </w:pPr>
-      <w:r>
-        <w:t>**Practices**: Component architecture, SEO, a11y, Performance Optimization</w:t>
+        <w:t>**Tools &amp; Practices**: Git, GitHub, JIRA, Component Architecture, Code Splitting, SEO, a11y, Performance Optimization</w:t>
       </w:r>
     </w:p>
     <w:p>
@@ -98,16 +90,8 @@
       </w:r>
     </w:p>
     <w:p>
-      <w:pPr>
-        <w:pStyle w:val="Heading3"/>
-      </w:pPr>
       <w:r>
-        <w:t>Full Stack Developer | Revnix (fmr. Revnix Technologies)</w:t>
-      </w:r>
-    </w:p>
-    <w:p>
-      <w:r>
-        <w:t>*Jan 2025 - Present*</w:t>
+        <w:t>**Full Stack Developer** | Revnix (fmr. Revnix Technologies) | Jan 2025 - Present</w:t>
       </w:r>
     </w:p>
     <w:p>
@@ -115,7 +99,7 @@
         <w:pStyle w:val="ListBullet"/>
       </w:pPr>
       <w:r>
-        <w:t>Architected and shipped production features for an enterprise headless CMS (Nextly) using Next.js App Router, TypeScript, and TanStack Query</w:t>
+        <w:t>Architected and shipped production features for an enterprise headless CMS using Next.js App Router, TypeScript, and TanStack Query</w:t>
       </w:r>
     </w:p>
     <w:p>
@@ -123,7 +107,7 @@
         <w:pStyle w:val="ListBullet"/>
       </w:pPr>
       <w:r>
-        <w:t>Owned the full authentication and access control layer: JWT-based auth and a flexible RBAC system</w:t>
+        <w:t>Owned the full authentication and access control layer with JWT-based auth and a flexible RBAC system</w:t>
       </w:r>
     </w:p>
     <w:p>
@@ -147,7 +131,7 @@
         <w:pStyle w:val="ListBullet"/>
       </w:pPr>
       <w:r>
-        <w:t>Built a fully customizable admin dashboard with Tailwind CSS, adhering to strict a11y and SEO standards</w:t>
+        <w:t>Built a fully customizable admin dashboard with pixel-perfect UIs using Tailwind CSS</w:t>
       </w:r>
     </w:p>
     <w:p>
@@ -159,16 +143,8 @@
       </w:r>
     </w:p>
     <w:p>
-      <w:pPr>
-        <w:pStyle w:val="Heading3"/>
-      </w:pPr>
       <w:r>
-        <w:t>Nextly - Enterprise Headless CMS &amp; SaaS Framework</w:t>
-      </w:r>
-    </w:p>
-    <w:p>
-      <w:r>
-        <w:t>*Live Production*</w:t>
+        <w:t>**Nextly** - Enterprise Headless CMS &amp; SaaS Framework</w:t>
       </w:r>
     </w:p>
     <w:p>
@@ -176,7 +152,7 @@
         <w:pStyle w:val="ListBullet"/>
       </w:pPr>
       <w:r>
-        <w:t>Built a TypeScript-first CMS framework for content-driven products using Next.js, TypeScript, and Drizzle ORM</w:t>
+        <w:t>Built a TypeScript-first CMS framework using Next.js, TypeScript, and Drizzle ORM</w:t>
       </w:r>
     </w:p>
     <w:p>
@@ -184,15 +160,7 @@
         <w:pStyle w:val="ListBullet"/>
       </w:pPr>
       <w:r>
-        <w:t>Implemented dual-mode content workflow: code-defined models plus drag-and-drop visual builder</w:t>
-      </w:r>
-    </w:p>
-    <w:p>
-      <w:pPr>
-        <w:pStyle w:val="ListBullet"/>
-      </w:pPr>
-      <w:r>
-        <w:t>Developed RBAC system with permissions for team content access</w:t>
+        <w:t>Implemented dual-mode content workflow with code-defined models and visual builder</w:t>
       </w:r>
     </w:p>
     <w:p>
@@ -208,20 +176,12 @@
         <w:pStyle w:val="ListBullet"/>
       </w:pPr>
       <w:r>
-        <w:t>Implemented containerized deployment with Docker and CI/CD pipelines</w:t>
-      </w:r>
-    </w:p>
-    <w:p>
-      <w:pPr>
-        <w:pStyle w:val="Heading3"/>
-      </w:pPr>
-      <w:r>
-        <w:t>RextAI - AI-Powered Content Intelligence Platform</w:t>
+        <w:t>Developed containerized solution with Docker and CI/CD on Vercel</w:t>
       </w:r>
     </w:p>
     <w:p>
       <w:r>
-        <w:t>*Live Production*</w:t>
+        <w:t>**RextAI** - AI-Powered Content Intelligence Platform</w:t>
       </w:r>
     </w:p>
     <w:p>
@@ -229,7 +189,7 @@
         <w:pStyle w:val="ListBullet"/>
       </w:pPr>
       <w:r>
-        <w:t>Developed SaaS platform for AI-driven content generation and workflow automation</w:t>
+        <w:t>Developed SaaS platform using Next.js, React.js, TypeScript, and Node.js</w:t>
       </w:r>
     </w:p>
     <w:p>
@@ -237,7 +197,7 @@
         <w:pStyle w:val="ListBullet"/>
       </w:pPr>
       <w:r>
-        <w:t>Built AI article generation editor with keyword input and optimization controls</w:t>
+        <w:t>Implemented AI article generation with keyword input and optimization controls</w:t>
       </w:r>
     </w:p>
     <w:p>
@@ -245,7 +205,7 @@
         <w:pStyle w:val="ListBullet"/>
       </w:pPr>
       <w:r>
-        <w:t>Integrated CMS auto-publish functionality with WordPress, Webflow, and Ghost APIs</w:t>
+        <w:t>Integrated CMS auto-publish with WordPress, Webflow, and Ghost APIs</w:t>
       </w:r>
     </w:p>
     <w:p>
@@ -253,20 +213,12 @@
         <w:pStyle w:val="ListBullet"/>
       </w:pPr>
       <w:r>
-        <w:t>Optimized frontend performance using SSR, caching, and code splitting</w:t>
-      </w:r>
-    </w:p>
-    <w:p>
-      <w:pPr>
-        <w:pStyle w:val="Heading3"/>
-      </w:pPr>
-      <w:r>
-        <w:t>HireIQ - AI-Powered Recruitment &amp; Evaluation Platform</w:t>
+        <w:t>Optimized frontend performance with SSR, caching, and code splitting</w:t>
       </w:r>
     </w:p>
     <w:p>
       <w:r>
-        <w:t>*Live Production*</w:t>
+        <w:t>**HireIQ** - AI-Powered Recruitment &amp; Evaluation Platform</w:t>
       </w:r>
     </w:p>
     <w:p>
@@ -274,7 +226,7 @@
         <w:pStyle w:val="ListBullet"/>
       </w:pPr>
       <w:r>
-        <w:t>Created AI-assisted recruitment and candidate evaluation platform</w:t>
+        <w:t>Built AI-assisted recruitment platform using Next.js, React, TypeScript, and Node.js</w:t>
       </w:r>
     </w:p>
     <w:p>
@@ -282,7 +234,12 @@
         <w:pStyle w:val="ListBullet"/>
       </w:pPr>
       <w:r>
-        <w:t>Implemented full-stack application with Next.js, React, TypeScript, and Node.js</w:t>
+        <w:t>Implemented LangChain and LangGraph for AI-driven candidate evaluation</w:t>
+      </w:r>
+    </w:p>
+    <w:p>
+      <w:r>
+        <w:t>**21Century Equipment** - B2B Equipment Management Platform</w:t>
       </w:r>
     </w:p>
     <w:p>
@@ -290,7 +247,20 @@
         <w:pStyle w:val="ListBullet"/>
       </w:pPr>
       <w:r>
-        <w:t>Integrated LangChain and OpenAI API for AI-powered features</w:t>
+        <w:t>Developed Next.js application with Redux Toolkit, Stripe, and Google Maps API</w:t>
+      </w:r>
+    </w:p>
+    <w:p>
+      <w:r>
+        <w:t>**4Rivers Equipment** - Enterprise E-Commerce &amp; Rental Platform</w:t>
+      </w:r>
+    </w:p>
+    <w:p>
+      <w:pPr>
+        <w:pStyle w:val="ListBullet"/>
+      </w:pPr>
+      <w:r>
+        <w:t>Built Next.js application with Redux Toolkit, Stripe, and Google Maps integration</w:t>
       </w:r>
     </w:p>
     <w:p>
@@ -303,12 +273,15 @@
     </w:p>
     <w:p>
       <w:r>
-        <w:t>**BS in Computer Science** | University of Haripur</w:t>
+        <w:t>**BS in Computer Science** | University of Haripur | Aug 2020 - Aug 2024</w:t>
       </w:r>
     </w:p>
     <w:p>
+      <w:pPr>
+        <w:pStyle w:val="ListBullet"/>
+      </w:pPr>
       <w:r>
-        <w:t>*Aug 2020 - Aug 2024* | Haripur, Pakistan</w:t>
+        <w:t>Haripur, Pakistan</w:t>
       </w:r>
     </w:p>
     <w:p>

</xml_diff>

<commit_message>
ci: daily run 2026-10-01
</commit_message>
<xml_diff>
--- a/tailored/cv_allstar-technology_mernstack-developer-node-js.docx
+++ b/tailored/cv_allstar-technology_mernstack-developer-node-js.docx
@@ -12,12 +12,17 @@
     </w:p>
     <w:p>
       <w:r>
-        <w:t>Full Stack Developer (MERN / PERN / Next.js - SaaS) | Islamabad, Pakistan</w:t>
+        <w:t xml:space="preserve">**Full Stack Developer (MERN / PERN / Next.js - SaaS)**  </w:t>
       </w:r>
     </w:p>
     <w:p>
       <w:r>
-        <w:t>muzzamilhassandev@gmail.com | +923055779207 | https://muzzamilhassandev.vercel.app/</w:t>
+        <w:t xml:space="preserve">Islamabad, Pakistan | muzzamilhassandev@gmail.com | +923055779207  </w:t>
+      </w:r>
+    </w:p>
+    <w:p>
+      <w:r>
+        <w:t>LinkedIn: https://www.linkedin.com/in/muzzamilhassann/ | GitHub: https://github.com/muzzamilhassan/ | Portfolio: https://muzzamilhassandev.vercel.app/</w:t>
       </w:r>
     </w:p>
     <w:p>
@@ -30,7 +35,7 @@
     </w:p>
     <w:p>
       <w:r>
-        <w:t>Full Stack Developer with expertise in architecting and shipping production-grade SaaS products using the MERN stack. Proficient in Next.js, Express.js, TypeScript, and PostgreSQL with experience in building scalable backend APIs and modern frontend interfaces. Experienced with CI/CD pipelines, cloud deployment, and microservice architectures. Demonstrated success in developing AI-powered platforms and content management systems with strong focus on performance optimization and security.</w:t>
+        <w:t>Full Stack Developer with expertise in the MERN stack, specializing in Next.js, Express.js, and TypeScript. Experienced in building production-grade SaaS products with strong backend development capabilities, particularly with PostgreSQL. Proficient in creating modern frontend interfaces with Tailwind CSS and optimizing system performance. Skilled in database design, API development, and CI/CD pipeline implementation.</w:t>
       </w:r>
     </w:p>
     <w:p>
@@ -42,51 +47,28 @@
       </w:r>
     </w:p>
     <w:p>
-      <w:pPr>
-        <w:pStyle w:val="ListBullet"/>
-      </w:pPr>
       <w:r>
-        <w:t>**Frontend**: Next.js, React.js, TypeScript, Tailwind CSS, Redux Toolkit, TanStack Query</w:t>
+        <w:t xml:space="preserve">**Frontend Development:** Next.js, React.js, TypeScript, Tailwind CSS, Redux Toolkit, TanStack Query  </w:t>
       </w:r>
     </w:p>
     <w:p>
-      <w:pPr>
-        <w:pStyle w:val="ListBullet"/>
-      </w:pPr>
       <w:r>
-        <w:t>**Backend**: Node.js, Express.js, NestJS, TypeScript, REST API Design, JWT/OAuth2 Authentication</w:t>
+        <w:t xml:space="preserve">**Backend Development:** Node.js, Express.js, NestJS, REST API Design, JWT/OAuth2 Authentication, RBAC  </w:t>
       </w:r>
     </w:p>
     <w:p>
-      <w:pPr>
-        <w:pStyle w:val="ListBullet"/>
-      </w:pPr>
       <w:r>
-        <w:t>**Databases**: PostgreSQL, MySQL, SQLite, MongoDB, Drizzle ORM, Firebase, Supabase</w:t>
+        <w:t xml:space="preserve">**Database Management:** PostgreSQL, MySQL, SQLite, MongoDB, Drizzle ORM, Firebase, Supabase  </w:t>
       </w:r>
     </w:p>
     <w:p>
-      <w:pPr>
-        <w:pStyle w:val="ListBullet"/>
-      </w:pPr>
       <w:r>
-        <w:t>**AI/ML**: LangChain, LangGraph, OpenAI API</w:t>
+        <w:t xml:space="preserve">**Cloud &amp; DevOps:** Vercel (CI/CD, Edge Functions), Docker, GitHub Actions, AWS Amplify  </w:t>
       </w:r>
     </w:p>
     <w:p>
-      <w:pPr>
-        <w:pStyle w:val="ListBullet"/>
-      </w:pPr>
       <w:r>
-        <w:t>**Cloud &amp; DevOps**: Vercel, Docker, GitHub Actions, AWS Amplify</w:t>
-      </w:r>
-    </w:p>
-    <w:p>
-      <w:pPr>
-        <w:pStyle w:val="ListBullet"/>
-      </w:pPr>
-      <w:r>
-        <w:t>**Tools &amp; Practices**: Git, GitHub, JIRA, Figma, Component Architecture, SEO, a11y, Performance Optimization</w:t>
+        <w:t>**Tools &amp; Practices:** Git, GitHub, JIRA, Figma, Component Architecture, Performance Optimization, SEO, a11y</w:t>
       </w:r>
     </w:p>
     <w:p>
@@ -98,16 +80,13 @@
       </w:r>
     </w:p>
     <w:p>
-      <w:pPr>
-        <w:pStyle w:val="Heading3"/>
-      </w:pPr>
       <w:r>
-        <w:t>Full Stack Developer | Revnix (fmr. Revnix Technologies)</w:t>
+        <w:t xml:space="preserve">**Full Stack Developer** | Revnix (fmr. Revnix Technologies) | Islamabad, Pakistan  </w:t>
       </w:r>
     </w:p>
     <w:p>
       <w:r>
-        <w:t>Jan 2025 - Present | Islamabad, Pakistan</w:t>
+        <w:t xml:space="preserve">*Jan 2023 - Present*  </w:t>
       </w:r>
     </w:p>
     <w:p>
@@ -123,7 +102,7 @@
         <w:pStyle w:val="ListBullet"/>
       </w:pPr>
       <w:r>
-        <w:t>Built secure backend APIs with Express.js and TypeScript, implementing JWT-based authentication and flexible RBAC system</w:t>
+        <w:t>Owned the full authentication and access control layer: JWT-based auth and a flexible RBAC system</w:t>
       </w:r>
     </w:p>
     <w:p>
@@ -131,7 +110,7 @@
         <w:pStyle w:val="ListBullet"/>
       </w:pPr>
       <w:r>
-        <w:t>Designed and maintained a pluggable multi-database adapter system supporting PostgreSQL, MySQL, and SQLite</w:t>
+        <w:t>Designed and maintained a pluggable multi-database adapter system with PostgreSQL, MySQL, and SQLite</w:t>
       </w:r>
     </w:p>
     <w:p>
@@ -139,7 +118,7 @@
         <w:pStyle w:val="ListBullet"/>
       </w:pPr>
       <w:r>
-        <w:t>Optimized system performance through SSR, caching, lazy loading, and code splitting</w:t>
+        <w:t>Built secure, scalable backend APIs using Express.js and TypeScript</w:t>
       </w:r>
     </w:p>
     <w:p>
@@ -147,7 +126,7 @@
         <w:pStyle w:val="ListBullet"/>
       </w:pPr>
       <w:r>
-        <w:t>Developed fully customizable admin dashboard with responsive UIs using Tailwind CSS</w:t>
+        <w:t>Optimized performance and UX through SSR, caching, lazy loading, and code splitting</w:t>
       </w:r>
     </w:p>
     <w:p>
@@ -155,7 +134,15 @@
         <w:pStyle w:val="ListBullet"/>
       </w:pPr>
       <w:r>
-        <w:t>Implemented CI/CD pipelines using Docker and Vercel for streamlined development and deployment</w:t>
+        <w:t>Developed a fully customizable admin dashboard with responsive UIs using Tailwind CSS</w:t>
+      </w:r>
+    </w:p>
+    <w:p>
+      <w:pPr>
+        <w:pStyle w:val="ListBullet"/>
+      </w:pPr>
+      <w:r>
+        <w:t>Implemented CI/CD pipelines using GitHub Actions and Docker for streamlined development and deployment</w:t>
       </w:r>
     </w:p>
     <w:p>
@@ -163,15 +150,12 @@
         <w:pStyle w:val="Heading2"/>
       </w:pPr>
       <w:r>
-        <w:t>PROJECTS</w:t>
+        <w:t>KEY PROJECTS</w:t>
       </w:r>
     </w:p>
     <w:p>
-      <w:pPr>
-        <w:pStyle w:val="Heading3"/>
-      </w:pPr>
       <w:r>
-        <w:t>Nextly - Enterprise Headless CMS &amp; SaaS Framework</w:t>
+        <w:t xml:space="preserve">**Nextly - Enterprise Headless CMS &amp; SaaS Framework**  </w:t>
       </w:r>
     </w:p>
     <w:p>
@@ -179,7 +163,7 @@
         <w:pStyle w:val="ListBullet"/>
       </w:pPr>
       <w:r>
-        <w:t>Developed a TypeScript-first CMS framework using Next.js, comparable to Payload CMS or Sanity</w:t>
+        <w:t>Built a TypeScript-first CMS framework for content-driven products using Next.js, comparable to Payload CMS</w:t>
       </w:r>
     </w:p>
     <w:p>
@@ -187,7 +171,7 @@
         <w:pStyle w:val="ListBullet"/>
       </w:pPr>
       <w:r>
-        <w:t>Implemented dual-mode content workflow with code-defined models and drag-and-drop visual builder</w:t>
+        <w:t>Implemented dual-mode content workflow with code-defined models and visual builder</w:t>
       </w:r>
     </w:p>
     <w:p>
@@ -195,7 +179,7 @@
         <w:pStyle w:val="ListBullet"/>
       </w:pPr>
       <w:r>
-        <w:t>Created pluggable database adapters supporting PostgreSQL, MySQL, and SQLite via Drizzle ORM</w:t>
+        <w:t>Developed RBAC system with permissions for team content access</w:t>
       </w:r>
     </w:p>
     <w:p>
@@ -203,15 +187,20 @@
         <w:pStyle w:val="ListBullet"/>
       </w:pPr>
       <w:r>
-        <w:t>Built containerized application with Docker and CI/CD on Vercel</w:t>
+        <w:t>Created pluggable database adapters for PostgreSQL, MySQL, and SQLite using Drizzle ORM</w:t>
       </w:r>
     </w:p>
     <w:p>
       <w:pPr>
-        <w:pStyle w:val="Heading3"/>
+        <w:pStyle w:val="ListBullet"/>
       </w:pPr>
       <w:r>
-        <w:t>RextAI - AI-Powered Content Intelligence Platform</w:t>
+        <w:t>Set up containerized environment with Docker and CI/CD on Vercel</w:t>
+      </w:r>
+    </w:p>
+    <w:p>
+      <w:r>
+        <w:t xml:space="preserve">**RextAI - AI-Powered Content Intelligence Platform**  </w:t>
       </w:r>
     </w:p>
     <w:p>
@@ -227,7 +216,7 @@
         <w:pStyle w:val="ListBullet"/>
       </w:pPr>
       <w:r>
-        <w:t>Implemented AI article generation with keyword input and E-E-A-T optimization controls</w:t>
+        <w:t>Built AI article generation editor with keyword input and optimization controls</w:t>
       </w:r>
     </w:p>
     <w:p>
@@ -235,7 +224,7 @@
         <w:pStyle w:val="ListBullet"/>
       </w:pPr>
       <w:r>
-        <w:t>Integrated CMS auto-publish functionality with WordPress, Webflow, and Ghost APIs</w:t>
+        <w:t>Implemented one-click CMS auto-publish integrating WordPress, Webflow, and Ghost APIs</w:t>
       </w:r>
     </w:p>
     <w:p>
@@ -247,11 +236,8 @@
       </w:r>
     </w:p>
     <w:p>
-      <w:pPr>
-        <w:pStyle w:val="Heading3"/>
-      </w:pPr>
       <w:r>
-        <w:t>HireIQ - AI-Powered Recruitment &amp; Evaluation Platform</w:t>
+        <w:t xml:space="preserve">**HireIQ - AI-Powered Recruitment &amp; Evaluation Platform**  </w:t>
       </w:r>
     </w:p>
     <w:p>
@@ -259,7 +245,7 @@
         <w:pStyle w:val="ListBullet"/>
       </w:pPr>
       <w:r>
-        <w:t>Built AI-assisted recruitment and candidate evaluation platform end-to-end</w:t>
+        <w:t>Created AI-assisted recruitment and candidate evaluation platform</w:t>
       </w:r>
     </w:p>
     <w:p>
@@ -267,7 +253,7 @@
         <w:pStyle w:val="ListBullet"/>
       </w:pPr>
       <w:r>
-        <w:t>Implemented LangChain and LangGraph for AI-driven candidate assessment</w:t>
+        <w:t>Integrated LangChain and OpenAI API for intelligent candidate assessment</w:t>
       </w:r>
     </w:p>
     <w:p>
@@ -275,7 +261,7 @@
         <w:pStyle w:val="ListBullet"/>
       </w:pPr>
       <w:r>
-        <w:t>Created responsive UI with Next.js and TypeScript</w:t>
+        <w:t>Developed secure backend APIs with Express.js and TypeScript</w:t>
       </w:r>
     </w:p>
     <w:p>
@@ -287,21 +273,13 @@
       </w:r>
     </w:p>
     <w:p>
-      <w:pPr>
-        <w:pStyle w:val="Heading3"/>
-      </w:pPr>
       <w:r>
-        <w:t>BS in Computer Science</w:t>
+        <w:t xml:space="preserve">**BS in Computer Science** | University of Haripur | Haripur, Pakistan  </w:t>
       </w:r>
     </w:p>
     <w:p>
       <w:r>
-        <w:t>University of Haripur | Haripur, Pakistan</w:t>
-      </w:r>
-    </w:p>
-    <w:p>
-      <w:r>
-        <w:t>Aug 2020 - Aug 2024</w:t>
+        <w:t>*Aug 2020 - Aug 2024*</w:t>
       </w:r>
     </w:p>
     <w:p>

</xml_diff>